<commit_message>
Diagrama de la Tarea 1.2 en draw.io y ficha del centro en la Tarea 1.1
</commit_message>
<xml_diff>
--- a/Fundamentos-de-la-Nube/Tarea-1.1-Centros-de-Datos/entrega/fci_t1.1_lopez_nunez.docx
+++ b/Fundamentos-de-la-Nube/Tarea-1.1-Centros-de-Datos/entrega/fci_t1.1_lopez_nunez.docx
@@ -179,7 +179,7 @@
         <w:pStyle w:val="Cuerpodetexto"/>
       </w:pPr>
       <w:r>
-        <w:t>El operador, Templus, se presenta como una red europea de centros de datos regionales y tiene 17 sedes en España, Portugal, Reino Unido, Francia, Italia, Países Bajos, Dinamarca y Suiza. En la Fig. 1 se ve su posición en el mapa de DataCenterMap, al noroeste de Valencia ciudad.</w:t>
+        <w:t>El operador, Templus, se presenta como una red europea de centros de datos regionales y tiene 17 sedes en España, Portugal, Reino Unido, Francia, Italia, Países Bajos, Dinamarca y Suiza. La Fig. 1 recoge la ficha que publica Templus del centro en su web, y la Fig. 2 su posición en el mapa de DataCenterMap, al noroeste de Valencia ciudad.</w:t>
       </w:r>
     </w:p>
     <w:p>
@@ -199,8 +199,65 @@
       <w:r>
         <w:drawing>
           <wp:inline xmlns:a="http://schemas.openxmlformats.org/drawingml/2006/main" xmlns:pic="http://schemas.openxmlformats.org/drawingml/2006/picture">
+            <wp:extent cx="5760000" cy="1801173"/>
+            <wp:docPr id="1" name="Picture 1"/>
+            <wp:cNvGraphicFramePr>
+              <a:graphicFrameLocks noChangeAspect="1"/>
+            </wp:cNvGraphicFramePr>
+            <a:graphic>
+              <a:graphicData uri="http://schemas.openxmlformats.org/drawingml/2006/picture">
+                <pic:pic>
+                  <pic:nvPicPr>
+                    <pic:cNvPr id="0" name="02-ficha-templus-val01.png"/>
+                    <pic:cNvPicPr/>
+                  </pic:nvPicPr>
+                  <pic:blipFill>
+                    <a:blip r:embed="rId23"/>
+                    <a:stretch>
+                      <a:fillRect/>
+                    </a:stretch>
+                  </pic:blipFill>
+                  <pic:spPr>
+                    <a:xfrm>
+                      <a:off x="0" y="0"/>
+                      <a:ext cx="5760000" cy="1801173"/>
+                    </a:xfrm>
+                    <a:prstGeom prst="rect"/>
+                  </pic:spPr>
+                </pic:pic>
+              </a:graphicData>
+            </a:graphic>
+          </wp:inline>
+        </w:drawing>
+      </w:r>
+    </w:p>
+    <w:p>
+      <w:pPr>
+        <w:pStyle w:val="Figurecaption"/>
+      </w:pPr>
+      <w:r>
+        <w:t>Ficha de Templus Valencia VAL01 en la web del operador.</w:t>
+      </w:r>
+    </w:p>
+    <w:p>
+      <w:pPr>
+        <w:pStyle w:val="Figurecaption"/>
+        <w:keepNext/>
+        <w:numPr>
+          <w:ilvl w:val="0"/>
+          <w:numId w:val="0"/>
+        </w:numPr>
+        <w:ind w:left="0" w:hanging="0"/>
+        <w:jc w:val="center"/>
+        <w:rPr>
+          <w:lang w:val="es-ES"/>
+        </w:rPr>
+      </w:pPr>
+      <w:r>
+        <w:drawing>
+          <wp:inline xmlns:a="http://schemas.openxmlformats.org/drawingml/2006/main" xmlns:pic="http://schemas.openxmlformats.org/drawingml/2006/picture">
             <wp:extent cx="5760000" cy="1978597"/>
-            <wp:docPr id="1" name="Picture 1"/>
+            <wp:docPr id="2" name="Picture 2"/>
             <wp:cNvGraphicFramePr>
               <a:graphicFrameLocks noChangeAspect="1"/>
             </wp:cNvGraphicFramePr>
@@ -212,7 +269,7 @@
                     <pic:cNvPicPr/>
                   </pic:nvPicPr>
                   <pic:blipFill>
-                    <a:blip r:embed="rId23"/>
+                    <a:blip r:embed="rId24"/>
                     <a:stretch>
                       <a:fillRect/>
                     </a:stretch>

</xml_diff>